<commit_message>
Exposé light final version
</commit_message>
<xml_diff>
--- a/Theorie/Expose_light_BA1_2.docx
+++ b/Theorie/Expose_light_BA1_2.docx
@@ -86,25 +86,7 @@
           <w:sz w:val="28"/>
           <w:szCs w:val="28"/>
         </w:rPr>
-        <w:t>„</w:t>
-      </w:r>
-      <w:proofErr w:type="gramStart"/>
-      <w:r>
-        <w:rPr>
-          <w:b/>
-          <w:sz w:val="28"/>
-          <w:szCs w:val="28"/>
-        </w:rPr>
-        <w:t>Exposé</w:t>
-      </w:r>
-      <w:proofErr w:type="gramEnd"/>
-      <w:r>
-        <w:rPr>
-          <w:b/>
-          <w:sz w:val="28"/>
-          <w:szCs w:val="28"/>
-        </w:rPr>
-        <w:t xml:space="preserve"> light“ für Bachelorarbeit </w:t>
+        <w:t xml:space="preserve">„Exposé light“ für Bachelorarbeit </w:t>
       </w:r>
       <w:r>
         <w:rPr>
@@ -149,10 +131,10 @@
         <w:spacing w:before="120"/>
       </w:pPr>
       <w:r>
-        <w:t>Susanne Lastowicka, Alexander Lux</w:t>
+        <w:t xml:space="preserve">Name(n) der/s Studierenden: </w:t>
       </w:r>
       <w:r>
-        <w:t xml:space="preserve">: </w:t>
+        <w:t>Susanne Lastowicka, Alexander Lux</w:t>
       </w:r>
     </w:p>
     <w:tbl>
@@ -214,23 +196,7 @@
                 <w:sz w:val="22"/>
                 <w:szCs w:val="22"/>
               </w:rPr>
-              <w:t xml:space="preserve">„Lademanagement für Elektrofahrzeuge mittels OCPP und </w:t>
-            </w:r>
-            <w:proofErr w:type="spellStart"/>
-            <w:r>
-              <w:rPr>
-                <w:sz w:val="22"/>
-                <w:szCs w:val="22"/>
-              </w:rPr>
-              <w:t>OpenEMS</w:t>
-            </w:r>
-            <w:proofErr w:type="spellEnd"/>
-            <w:r>
-              <w:rPr>
-                <w:sz w:val="22"/>
-                <w:szCs w:val="22"/>
-              </w:rPr>
-              <w:t>“</w:t>
+              <w:t>„Lademanagement für Elektrofahrzeuge mittels OCPP und OpenEMS“</w:t>
             </w:r>
           </w:p>
           <w:p>
@@ -284,31 +250,13 @@
               <w:spacing w:line="240" w:lineRule="auto"/>
               <w:rPr>
                 <w:sz w:val="22"/>
-                <w:szCs w:val="22"/>
-              </w:rPr>
-            </w:pPr>
-            <w:r>
-              <w:rPr>
-                <w:sz w:val="22"/>
-                <w:szCs w:val="22"/>
-              </w:rPr>
-              <w:t xml:space="preserve">Eine Wallbox wird installiert und über OCPP softwareseitig angebunden, mit </w:t>
-            </w:r>
-            <w:proofErr w:type="spellStart"/>
-            <w:r>
-              <w:rPr>
-                <w:sz w:val="22"/>
-                <w:szCs w:val="22"/>
-              </w:rPr>
-              <w:t>OpenEMS</w:t>
-            </w:r>
-            <w:proofErr w:type="spellEnd"/>
-            <w:r>
-              <w:rPr>
-                <w:sz w:val="22"/>
-                <w:szCs w:val="22"/>
-              </w:rPr>
-              <w:t xml:space="preserve"> verbunden und containerisiert bereitgestellt – inkl. optionaler Authentifizierung und grafischer Benutzeroberfläche.</w:t>
+              </w:rPr>
+            </w:pPr>
+            <w:r>
+              <w:rPr>
+                <w:sz w:val="22"/>
+              </w:rPr>
+              <w:t>Eine Wallbox wird installiert und über OCPP softwareseitig angebunden, mit OpenEMS verbunden und containerisiert bereitgestellt – inkl. optionaler Authentifizierung und grafischer Benutzeroberfläche.</w:t>
             </w:r>
           </w:p>
           <w:p>
@@ -335,7 +283,7 @@
                 <w:szCs w:val="22"/>
                 <w:u w:val="single"/>
               </w:rPr>
-              <w:t>Forschungsfragen:</w:t>
+              <w:t>Forschungsfrage:</w:t>
             </w:r>
           </w:p>
           <w:p>
@@ -361,21 +309,7 @@
               <w:rPr>
                 <w:sz w:val="22"/>
               </w:rPr>
-              <w:t xml:space="preserve">mittels OCPP an </w:t>
-            </w:r>
-            <w:proofErr w:type="spellStart"/>
-            <w:r>
-              <w:rPr>
-                <w:sz w:val="22"/>
-              </w:rPr>
-              <w:t>OpenEMS</w:t>
-            </w:r>
-            <w:proofErr w:type="spellEnd"/>
-            <w:r>
-              <w:rPr>
-                <w:sz w:val="22"/>
-              </w:rPr>
-              <w:t xml:space="preserve"> angebunden</w:t>
+              <w:t>mittels OCPP an OpenEMS angebunden</w:t>
             </w:r>
             <w:r>
               <w:rPr>
@@ -397,63 +331,97 @@
                 <w:sz w:val="22"/>
               </w:rPr>
             </w:pPr>
-            <w:r>
-              <w:rPr>
-                <w:sz w:val="22"/>
-              </w:rPr>
-              <w:t>Unterfrage:</w:t>
-            </w:r>
-          </w:p>
-          <w:p>
-            <w:pPr>
-              <w:spacing w:line="240" w:lineRule="auto"/>
-              <w:rPr>
-                <w:b/>
-                <w:bCs/>
-                <w:sz w:val="22"/>
-              </w:rPr>
-            </w:pPr>
-            <w:r>
-              <w:rPr>
-                <w:sz w:val="22"/>
-              </w:rPr>
-              <w:t xml:space="preserve">„Welche Steuerungsstrategien lassen sich über </w:t>
-            </w:r>
-            <w:proofErr w:type="spellStart"/>
-            <w:r>
-              <w:rPr>
-                <w:sz w:val="22"/>
-              </w:rPr>
-              <w:t>OpenEMS</w:t>
-            </w:r>
-            <w:proofErr w:type="spellEnd"/>
-            <w:r>
-              <w:rPr>
-                <w:sz w:val="22"/>
-              </w:rPr>
-              <w:t xml:space="preserve"> zur Optimierung der Energienutzung umsetzen?“</w:t>
-            </w:r>
-            <w:r>
-              <w:rPr>
-                <w:sz w:val="22"/>
-              </w:rPr>
-              <w:t xml:space="preserve"> </w:t>
-            </w:r>
-          </w:p>
-          <w:p>
-            <w:pPr>
-              <w:spacing w:line="240" w:lineRule="auto"/>
-              <w:rPr>
-                <w:sz w:val="22"/>
-              </w:rPr>
-            </w:pPr>
-            <w:r>
-              <w:rPr>
-                <w:b/>
-                <w:bCs/>
-                <w:sz w:val="22"/>
-              </w:rPr>
-              <w:t>2 weitere Unterfragen</w:t>
+          </w:p>
+          <w:p>
+            <w:pPr>
+              <w:spacing w:line="240" w:lineRule="auto"/>
+              <w:rPr>
+                <w:sz w:val="22"/>
+                <w:u w:val="single"/>
+              </w:rPr>
+            </w:pPr>
+            <w:r>
+              <w:rPr>
+                <w:sz w:val="22"/>
+                <w:u w:val="single"/>
+              </w:rPr>
+              <w:t>Unterfrage</w:t>
+            </w:r>
+            <w:r>
+              <w:rPr>
+                <w:sz w:val="22"/>
+                <w:u w:val="single"/>
+              </w:rPr>
+              <w:t>n</w:t>
+            </w:r>
+            <w:r>
+              <w:rPr>
+                <w:sz w:val="22"/>
+                <w:u w:val="single"/>
+              </w:rPr>
+              <w:t>:</w:t>
+            </w:r>
+          </w:p>
+          <w:p>
+            <w:pPr>
+              <w:pStyle w:val="Listenabsatz"/>
+              <w:numPr>
+                <w:ilvl w:val="0"/>
+                <w:numId w:val="3"/>
+              </w:numPr>
+              <w:spacing w:line="240" w:lineRule="auto"/>
+              <w:rPr>
+                <w:rFonts w:ascii="Times New Roman" w:eastAsia="Times New Roman" w:hAnsi="Times New Roman"/>
+                <w:szCs w:val="20"/>
+                <w:lang w:eastAsia="de-DE"/>
+              </w:rPr>
+            </w:pPr>
+            <w:r>
+              <w:rPr>
+                <w:rFonts w:ascii="Times New Roman" w:eastAsia="Times New Roman" w:hAnsi="Times New Roman"/>
+                <w:szCs w:val="20"/>
+                <w:lang w:eastAsia="de-DE"/>
+              </w:rPr>
+              <w:t>„Wie lässt sich die software- und hardwareseitige Anbindung einer Wallbox über das OCPP-Protokoll an OpenEMS gestalten, um eine zuverlässige Steuerung und Simulation von Ladevorgängen zu gewährleisten?“</w:t>
+            </w:r>
+          </w:p>
+          <w:p>
+            <w:pPr>
+              <w:pStyle w:val="Listenabsatz"/>
+              <w:numPr>
+                <w:ilvl w:val="0"/>
+                <w:numId w:val="3"/>
+              </w:numPr>
+              <w:spacing w:line="240" w:lineRule="auto"/>
+              <w:rPr>
+                <w:rFonts w:ascii="Times New Roman" w:eastAsia="Times New Roman" w:hAnsi="Times New Roman"/>
+                <w:szCs w:val="20"/>
+                <w:lang w:eastAsia="de-DE"/>
+              </w:rPr>
+            </w:pPr>
+            <w:r>
+              <w:rPr>
+                <w:rFonts w:ascii="Times New Roman" w:eastAsia="Times New Roman" w:hAnsi="Times New Roman"/>
+                <w:szCs w:val="20"/>
+                <w:lang w:eastAsia="de-DE"/>
+              </w:rPr>
+              <w:t xml:space="preserve">„Wie kann das Lademanagementsystem durch eine containerbasierte Architektur bereitgestellt werden und wie lässt sich das System über ein </w:t>
+            </w:r>
+            <w:r>
+              <w:rPr>
+                <w:rFonts w:ascii="Times New Roman" w:eastAsia="Times New Roman" w:hAnsi="Times New Roman"/>
+                <w:szCs w:val="20"/>
+                <w:lang w:eastAsia="de-DE"/>
+              </w:rPr>
+              <w:t>GUI</w:t>
+            </w:r>
+            <w:r>
+              <w:rPr>
+                <w:rFonts w:ascii="Times New Roman" w:eastAsia="Times New Roman" w:hAnsi="Times New Roman"/>
+                <w:szCs w:val="20"/>
+                <w:lang w:eastAsia="de-DE"/>
+              </w:rPr>
+              <w:t xml:space="preserve"> optimal bedienen und visualisieren?“</w:t>
             </w:r>
           </w:p>
           <w:p>
@@ -501,199 +469,268 @@
         <w:tc>
           <w:tcPr>
             <w:tcW w:w="9060" w:type="dxa"/>
+            <w:shd w:val="clear" w:color="auto" w:fill="FFFFFF" w:themeFill="background1"/>
           </w:tcPr>
           <w:p>
             <w:pPr>
               <w:spacing w:line="240" w:lineRule="auto"/>
               <w:rPr>
-                <w:sz w:val="22"/>
-                <w:szCs w:val="22"/>
-              </w:rPr>
-            </w:pPr>
-            <w:r>
-              <w:rPr>
-                <w:sz w:val="22"/>
-                <w:szCs w:val="22"/>
-              </w:rPr>
-              <w:t xml:space="preserve">Einbindung </w:t>
-            </w:r>
-            <w:r>
-              <w:rPr>
-                <w:sz w:val="22"/>
-                <w:szCs w:val="22"/>
-              </w:rPr>
-              <w:t xml:space="preserve">von OCPP und das Empfangen von Daten. Integration in </w:t>
-            </w:r>
-            <w:proofErr w:type="spellStart"/>
-            <w:r>
-              <w:rPr>
-                <w:sz w:val="22"/>
-                <w:szCs w:val="22"/>
-              </w:rPr>
-              <w:t>OpenEMS</w:t>
-            </w:r>
-            <w:proofErr w:type="spellEnd"/>
-            <w:r>
-              <w:rPr>
-                <w:sz w:val="22"/>
-                <w:szCs w:val="22"/>
-              </w:rPr>
-              <w:t xml:space="preserve">, Funktion von </w:t>
-            </w:r>
-            <w:proofErr w:type="spellStart"/>
-            <w:r>
-              <w:rPr>
-                <w:sz w:val="22"/>
-                <w:szCs w:val="22"/>
-              </w:rPr>
-              <w:t>OpenEMS</w:t>
-            </w:r>
-            <w:proofErr w:type="spellEnd"/>
-          </w:p>
-          <w:p>
-            <w:pPr>
-              <w:spacing w:line="240" w:lineRule="auto"/>
-              <w:rPr>
-                <w:b/>
-                <w:bCs/>
-                <w:sz w:val="22"/>
-                <w:szCs w:val="22"/>
-              </w:rPr>
-            </w:pPr>
-            <w:r>
-              <w:rPr>
-                <w:b/>
-                <w:bCs/>
-                <w:sz w:val="22"/>
-                <w:szCs w:val="22"/>
-              </w:rPr>
-              <w:t>Welches theoretische Fachwissen kommt aus welcher Quelle</w:t>
-            </w:r>
-            <w:r>
-              <w:rPr>
-                <w:b/>
-                <w:bCs/>
-                <w:sz w:val="22"/>
-                <w:szCs w:val="22"/>
-              </w:rPr>
-              <w:t>?</w:t>
-            </w:r>
-          </w:p>
-          <w:p>
-            <w:pPr>
-              <w:spacing w:line="240" w:lineRule="auto"/>
-              <w:rPr>
+                <w:bCs/>
+                <w:sz w:val="22"/>
+                <w:szCs w:val="22"/>
+              </w:rPr>
+            </w:pPr>
+            <w:r>
+              <w:rPr>
+                <w:bCs/>
+                <w:sz w:val="22"/>
+                <w:szCs w:val="22"/>
+              </w:rPr>
+              <w:t>Smart-Charging-Strategien bilden die Basis für die bedarfsgerechte Integration von Elektrofahrzeugen in das Stromnetz, um Lastspitzen zu vermeiden und Ladevorgänge dynamisch zu steuern. Dieser Ansatz ermöglicht eine netzdienliche Regelung der Ladeleistung und minimiert die Belastung der lokalen Energieinfrastruktur.</w:t>
+            </w:r>
+          </w:p>
+          <w:p>
+            <w:pPr>
+              <w:spacing w:line="240" w:lineRule="auto"/>
+              <w:rPr>
+                <w:bCs/>
+                <w:sz w:val="22"/>
+                <w:szCs w:val="22"/>
+                <w:lang w:val="en-GB"/>
+              </w:rPr>
+            </w:pPr>
+            <w:r>
+              <w:rPr>
+                <w:bCs/>
                 <w:sz w:val="22"/>
                 <w:szCs w:val="22"/>
                 <w:u w:val="single"/>
-                <w:lang w:val="en-US"/>
-              </w:rPr>
-            </w:pPr>
-            <w:proofErr w:type="spellStart"/>
-            <w:r>
-              <w:rPr>
+                <w:lang w:val="en-GB"/>
+              </w:rPr>
+              <w:t>Quelle:</w:t>
+            </w:r>
+            <w:r>
+              <w:rPr>
+                <w:bCs/>
+                <w:sz w:val="22"/>
+                <w:szCs w:val="22"/>
+                <w:lang w:val="en-GB"/>
+              </w:rPr>
+              <w:t xml:space="preserve"> O. Sadeghian, A. Oshnoei, B. Mohammadi-Ivatloo, V. Vahidinasab, and A. Anvari-Moghaddam, "A comprehensive review on electric vehicles smart charging: Solutions, strategies, technologies, and challenges," Journal of Energy Storage, vol. 54, p. 105241, Oct. 2022, doi: 10.1016/j.est.2022.105241.</w:t>
+            </w:r>
+          </w:p>
+          <w:p>
+            <w:pPr>
+              <w:spacing w:line="240" w:lineRule="auto"/>
+              <w:rPr>
+                <w:bCs/>
+                <w:sz w:val="22"/>
+                <w:szCs w:val="22"/>
+                <w:lang w:val="en-GB"/>
+              </w:rPr>
+            </w:pPr>
+          </w:p>
+          <w:p>
+            <w:pPr>
+              <w:spacing w:line="240" w:lineRule="auto"/>
+              <w:rPr>
+                <w:bCs/>
+                <w:sz w:val="22"/>
+                <w:szCs w:val="22"/>
+              </w:rPr>
+            </w:pPr>
+            <w:r>
+              <w:rPr>
+                <w:bCs/>
+                <w:sz w:val="22"/>
+                <w:szCs w:val="22"/>
+              </w:rPr>
+              <w:t>Das Open Charge Point Protocol (OCPP) definiert als herstellerunabhängiger Standard die Nachrichtenstrukturen und Kommunikationsabläufe zwischen Ladestationen und übergeordneten Managementsystemen. Auf dieser Basis lassen sich spezifische Steuerungsalgorithmen und Datenströme für die kontinuierliche Erfassung von Messwerten und den Empfang von Statusdaten umsetzen.</w:t>
+            </w:r>
+          </w:p>
+          <w:p>
+            <w:pPr>
+              <w:spacing w:line="240" w:lineRule="auto"/>
+              <w:rPr>
+                <w:bCs/>
+                <w:sz w:val="22"/>
+                <w:szCs w:val="22"/>
+                <w:lang w:val="en-GB"/>
+              </w:rPr>
+            </w:pPr>
+            <w:r>
+              <w:rPr>
+                <w:bCs/>
                 <w:sz w:val="22"/>
                 <w:szCs w:val="22"/>
                 <w:u w:val="single"/>
-                <w:lang w:val="en-US"/>
-              </w:rPr>
-              <w:t>Literaturquellen</w:t>
-            </w:r>
-            <w:proofErr w:type="spellEnd"/>
-            <w:r>
-              <w:rPr>
+                <w:lang w:val="en-GB"/>
+              </w:rPr>
+              <w:t>Quelle:</w:t>
+            </w:r>
+            <w:r>
+              <w:rPr>
+                <w:bCs/>
+                <w:sz w:val="22"/>
+                <w:szCs w:val="22"/>
+                <w:lang w:val="en-GB"/>
+              </w:rPr>
+              <w:t xml:space="preserve"> Open Charge Alliance, "Open Charge Point Protocol 1.6," Specification Edition 2 FINAL, Sep. 28, 2017.</w:t>
+            </w:r>
+          </w:p>
+          <w:p>
+            <w:pPr>
+              <w:spacing w:line="240" w:lineRule="auto"/>
+              <w:rPr>
+                <w:bCs/>
+                <w:sz w:val="22"/>
+                <w:szCs w:val="22"/>
+                <w:lang w:val="en-GB"/>
+              </w:rPr>
+            </w:pPr>
+            <w:r>
+              <w:rPr>
+                <w:bCs/>
                 <w:sz w:val="22"/>
                 <w:szCs w:val="22"/>
                 <w:u w:val="single"/>
-                <w:lang w:val="en-US"/>
-              </w:rPr>
-              <w:t>:</w:t>
-            </w:r>
-          </w:p>
-          <w:p>
-            <w:pPr>
-              <w:spacing w:line="240" w:lineRule="auto"/>
-              <w:rPr>
-                <w:sz w:val="22"/>
-                <w:szCs w:val="22"/>
                 <w:lang w:val="en-GB"/>
               </w:rPr>
-            </w:pPr>
-            <w:r>
-              <w:rPr>
+              <w:t>Quelle:</w:t>
+            </w:r>
+            <w:r>
+              <w:rPr>
+                <w:bCs/>
                 <w:sz w:val="22"/>
                 <w:szCs w:val="22"/>
                 <w:lang w:val="en-GB"/>
               </w:rPr>
-              <w:t xml:space="preserve">S. </w:t>
-            </w:r>
-            <w:proofErr w:type="spellStart"/>
-            <w:r>
-              <w:rPr>
+              <w:t xml:space="preserve"> S. Hsaini, M. Aksasse, and M. O. Bensalah, "An OCPP-based approach for electric vehicle charging management," Energies, vol. 15, no. 18, p. 6735, Sep. 2022, doi: 10.3390/en15186735.</w:t>
+            </w:r>
+          </w:p>
+          <w:p>
+            <w:pPr>
+              <w:spacing w:line="240" w:lineRule="auto"/>
+              <w:rPr>
+                <w:bCs/>
                 <w:sz w:val="22"/>
                 <w:szCs w:val="22"/>
                 <w:lang w:val="en-GB"/>
               </w:rPr>
-              <w:t>Hsaini</w:t>
-            </w:r>
-            <w:proofErr w:type="spellEnd"/>
-            <w:r>
-              <w:rPr>
+            </w:pPr>
+          </w:p>
+          <w:p>
+            <w:pPr>
+              <w:spacing w:line="240" w:lineRule="auto"/>
+              <w:rPr>
+                <w:bCs/>
+                <w:sz w:val="22"/>
+                <w:szCs w:val="22"/>
+              </w:rPr>
+            </w:pPr>
+            <w:r>
+              <w:rPr>
+                <w:bCs/>
+                <w:sz w:val="22"/>
+                <w:szCs w:val="22"/>
+              </w:rPr>
+              <w:t>Durch den Einsatz virtueller Ladesäulen lassen sich die Protokollkommunikation und die Steuerungslogik ohne das Risiko von Hardwarebeschädigungen vorab erproben. Simulierte Komponenten bilden dabei das Nachrichtenverhalten realer Ladestationen ab und ermöglichen flexible Tests komplexer Ladeszenarien.</w:t>
+            </w:r>
+          </w:p>
+          <w:p>
+            <w:pPr>
+              <w:spacing w:line="240" w:lineRule="auto"/>
+              <w:rPr>
+                <w:bCs/>
                 <w:sz w:val="22"/>
                 <w:szCs w:val="22"/>
                 <w:lang w:val="en-GB"/>
               </w:rPr>
-              <w:t xml:space="preserve"> et al.</w:t>
-            </w:r>
-            <w:r>
-              <w:rPr>
-                <w:sz w:val="22"/>
-                <w:szCs w:val="22"/>
+            </w:pPr>
+            <w:r>
+              <w:rPr>
+                <w:bCs/>
+                <w:sz w:val="22"/>
+                <w:szCs w:val="22"/>
+                <w:u w:val="single"/>
                 <w:lang w:val="en-GB"/>
               </w:rPr>
-              <w:t xml:space="preserve">, "An OCPP-based approach for electric vehicle charging management," </w:t>
-            </w:r>
-            <w:r>
-              <w:rPr>
-                <w:i/>
-                <w:iCs/>
+              <w:t>Quelle:</w:t>
+            </w:r>
+            <w:r>
+              <w:rPr>
+                <w:bCs/>
                 <w:sz w:val="22"/>
                 <w:szCs w:val="22"/>
                 <w:lang w:val="en-GB"/>
               </w:rPr>
-              <w:t>Energies</w:t>
-            </w:r>
-            <w:r>
-              <w:rPr>
+              <w:t xml:space="preserve"> S. Y. Mattepu, S. S. S. R. D. Manikonda, and S. S. Williamson, "OCSS: An application to simulate multiple charging stations which uses an Open charge point protocol for communication," in Proc. 2022 IEEE 13th Int. Symp. Power Electron. Distrib. Gener. Syst. (PEDG), Kiel, Germany, 2022, pp. 1–6, doi: 10.1109/PEDG54999.2022.9923317.</w:t>
+            </w:r>
+          </w:p>
+          <w:p>
+            <w:pPr>
+              <w:spacing w:line="240" w:lineRule="auto"/>
+              <w:rPr>
+                <w:bCs/>
+                <w:sz w:val="22"/>
+                <w:szCs w:val="22"/>
+              </w:rPr>
+            </w:pPr>
+          </w:p>
+          <w:p>
+            <w:pPr>
+              <w:spacing w:line="240" w:lineRule="auto"/>
+              <w:rPr>
+                <w:bCs/>
+                <w:sz w:val="22"/>
+                <w:szCs w:val="22"/>
+              </w:rPr>
+            </w:pPr>
+            <w:r>
+              <w:rPr>
+                <w:bCs/>
+                <w:sz w:val="22"/>
+                <w:szCs w:val="22"/>
+              </w:rPr>
+              <w:lastRenderedPageBreak/>
+              <w:t>OpenEMS bietet eine modulare, quelloffene Systemarchitektur zur Steuerung und Zusammenführung verschiedener Energieerzeuger, -speicher und -verbraucher. Über vordefinierte Software-Schnittstellen lässt sich die OCPP-basierte Ladesteuerung nahtlos in das Gesamtsystem integrieren und mit weiteren Regelungsmodulen verknüpfen.</w:t>
+            </w:r>
+          </w:p>
+          <w:p>
+            <w:pPr>
+              <w:spacing w:line="240" w:lineRule="auto"/>
+              <w:rPr>
+                <w:bCs/>
                 <w:sz w:val="22"/>
                 <w:szCs w:val="22"/>
                 <w:lang w:val="en-GB"/>
               </w:rPr>
-              <w:t xml:space="preserve">, vol. 15, no. 18, p. 6735, Sep. 2022, </w:t>
-            </w:r>
-            <w:proofErr w:type="spellStart"/>
-            <w:r>
-              <w:rPr>
-                <w:sz w:val="22"/>
-                <w:szCs w:val="22"/>
+            </w:pPr>
+            <w:r>
+              <w:rPr>
+                <w:bCs/>
+                <w:sz w:val="22"/>
+                <w:szCs w:val="22"/>
+                <w:u w:val="single"/>
                 <w:lang w:val="en-GB"/>
               </w:rPr>
-              <w:t>doi</w:t>
-            </w:r>
-            <w:proofErr w:type="spellEnd"/>
-            <w:r>
-              <w:rPr>
+              <w:t>Quelle:</w:t>
+            </w:r>
+            <w:r>
+              <w:rPr>
+                <w:bCs/>
                 <w:sz w:val="22"/>
                 <w:szCs w:val="22"/>
                 <w:lang w:val="en-GB"/>
               </w:rPr>
-              <w:t>: 10.3390/en15186735.</w:t>
-            </w:r>
-          </w:p>
-          <w:p>
-            <w:pPr>
-              <w:spacing w:line="240" w:lineRule="auto"/>
-              <w:rPr>
+              <w:t xml:space="preserve"> OpenEMS Association e. V., "Introduction," OpenEMS Documentation, 2026. [Online]. Available: https://openems.github.io/openems.io/openems/latest/introduction.html. [Accessed: Oct. 11, 2026].</w:t>
+            </w:r>
+          </w:p>
+          <w:p>
+            <w:pPr>
+              <w:spacing w:line="240" w:lineRule="auto"/>
+              <w:rPr>
+                <w:bCs/>
                 <w:sz w:val="22"/>
                 <w:szCs w:val="22"/>
                 <w:lang w:val="en-GB"/>
@@ -704,6 +741,25 @@
             <w:pPr>
               <w:spacing w:line="240" w:lineRule="auto"/>
               <w:rPr>
+                <w:bCs/>
+                <w:sz w:val="22"/>
+                <w:szCs w:val="22"/>
+              </w:rPr>
+            </w:pPr>
+            <w:r>
+              <w:rPr>
+                <w:bCs/>
+                <w:sz w:val="22"/>
+                <w:szCs w:val="22"/>
+              </w:rPr>
+              <w:t>Die Containerisierung von Energiemanagementsystemen und Simulationsdiensten vereinfacht die Bereitstellung, da Anwendungsumgebungen isoliert und plattformunabhängig paketiert werden. Mikroservice-basierte Container-Architekturen erhöhen zudem die Systemstabilität und Flexibilität bei der Skalierung einzelner Systemkomponenten.</w:t>
+            </w:r>
+          </w:p>
+          <w:p>
+            <w:pPr>
+              <w:spacing w:line="240" w:lineRule="auto"/>
+              <w:rPr>
+                <w:bCs/>
                 <w:sz w:val="22"/>
                 <w:szCs w:val="22"/>
                 <w:lang w:val="en-GB"/>
@@ -711,482 +767,121 @@
             </w:pPr>
             <w:r>
               <w:rPr>
-                <w:sz w:val="22"/>
-                <w:szCs w:val="22"/>
+                <w:bCs/>
+                <w:sz w:val="22"/>
+                <w:szCs w:val="22"/>
+                <w:u w:val="single"/>
                 <w:lang w:val="en-GB"/>
               </w:rPr>
-              <w:t xml:space="preserve">S. Y. </w:t>
-            </w:r>
-            <w:proofErr w:type="spellStart"/>
-            <w:r>
-              <w:rPr>
+              <w:t>Quelle:</w:t>
+            </w:r>
+            <w:r>
+              <w:rPr>
+                <w:bCs/>
                 <w:sz w:val="22"/>
                 <w:szCs w:val="22"/>
                 <w:lang w:val="en-GB"/>
               </w:rPr>
-              <w:t>Mattepu</w:t>
-            </w:r>
-            <w:proofErr w:type="spellEnd"/>
-            <w:r>
-              <w:rPr>
+              <w:t xml:space="preserve"> Z. Li, H. Wei, C. Lian, and S. Qin, "Docker-Based Energy Management System Development and Deployment Methods," in Proc. 2020 4th Int. Conf. Power Energy Eng. (ICPEE), Xiamen, China, 2020, pp. 1–5, doi: 10.1109/ICPEE51316.2020.9311050.</w:t>
+            </w:r>
+          </w:p>
+          <w:p>
+            <w:pPr>
+              <w:spacing w:line="240" w:lineRule="auto"/>
+              <w:rPr>
+                <w:bCs/>
                 <w:sz w:val="22"/>
                 <w:szCs w:val="22"/>
                 <w:lang w:val="en-GB"/>
               </w:rPr>
-              <w:t xml:space="preserve"> et al.</w:t>
-            </w:r>
-            <w:r>
-              <w:rPr>
-                <w:sz w:val="22"/>
-                <w:szCs w:val="22"/>
+            </w:pPr>
+            <w:r>
+              <w:rPr>
+                <w:bCs/>
+                <w:sz w:val="22"/>
+                <w:szCs w:val="22"/>
+                <w:u w:val="single"/>
                 <w:lang w:val="en-GB"/>
               </w:rPr>
-              <w:t xml:space="preserve">, "OCSS: An application to simulate multiple charging stations which uses an Open charge point protocol for communication," in Proc. 2022 IEEE 13th Int. Symp. Power Electron. </w:t>
-            </w:r>
-            <w:proofErr w:type="spellStart"/>
-            <w:r>
-              <w:rPr>
+              <w:t>Quelle:</w:t>
+            </w:r>
+            <w:r>
+              <w:rPr>
+                <w:bCs/>
                 <w:sz w:val="22"/>
                 <w:szCs w:val="22"/>
                 <w:lang w:val="en-GB"/>
               </w:rPr>
-              <w:t>Distrib</w:t>
-            </w:r>
-            <w:proofErr w:type="spellEnd"/>
-            <w:r>
-              <w:rPr>
+              <w:t xml:space="preserve"> J. Perez, F. Quintal, and L. Pereira, "Distributed platform for offline and online EV charging simulation," Electronics, vol. 12, no. 21, Art. no. 4401, Oct. 2023, doi: 10.3390/electronics12214401.</w:t>
+            </w:r>
+          </w:p>
+          <w:p>
+            <w:pPr>
+              <w:spacing w:line="240" w:lineRule="auto"/>
+              <w:rPr>
+                <w:bCs/>
                 <w:sz w:val="22"/>
                 <w:szCs w:val="22"/>
                 <w:lang w:val="en-GB"/>
               </w:rPr>
-              <w:t xml:space="preserve">. Gener. Syst. (PEDG), Kiel, Germany, 2022, pp. 1–6, </w:t>
-            </w:r>
-            <w:proofErr w:type="spellStart"/>
-            <w:r>
-              <w:rPr>
+            </w:pPr>
+          </w:p>
+          <w:p>
+            <w:pPr>
+              <w:spacing w:line="240" w:lineRule="auto"/>
+              <w:rPr>
+                <w:bCs/>
+                <w:sz w:val="22"/>
+                <w:szCs w:val="22"/>
+              </w:rPr>
+            </w:pPr>
+            <w:r>
+              <w:rPr>
+                <w:bCs/>
+                <w:sz w:val="22"/>
+                <w:szCs w:val="22"/>
+              </w:rPr>
+              <w:t>Generische Benutzeroberflächen im Energiemanagement ermöglichen die intuitive Darstellung komplexer Systemzustände, Energiedaten und Ladevorgänge in Echtzeit. Ein durchdachtes UI-Design bietet zudem strukturierte Bedienelemente zur Interaktion und manuellen Steuerung des Gesamtsystems durch den Anwender.</w:t>
+            </w:r>
+          </w:p>
+          <w:p>
+            <w:pPr>
+              <w:spacing w:line="240" w:lineRule="auto"/>
+              <w:rPr>
+                <w:bCs/>
                 <w:sz w:val="22"/>
                 <w:szCs w:val="22"/>
                 <w:lang w:val="en-GB"/>
               </w:rPr>
-              <w:t>doi</w:t>
-            </w:r>
-            <w:proofErr w:type="spellEnd"/>
-            <w:r>
-              <w:rPr>
-                <w:sz w:val="22"/>
-                <w:szCs w:val="22"/>
+            </w:pPr>
+            <w:r>
+              <w:rPr>
+                <w:bCs/>
+                <w:sz w:val="22"/>
+                <w:szCs w:val="22"/>
+                <w:u w:val="single"/>
                 <w:lang w:val="en-GB"/>
               </w:rPr>
-              <w:t>: 10.1109/PEDG54999.2022.9923317.</w:t>
-            </w:r>
-          </w:p>
-          <w:p>
-            <w:pPr>
-              <w:spacing w:line="240" w:lineRule="auto"/>
-              <w:rPr>
+              <w:t>Quelle:</w:t>
+            </w:r>
+            <w:r>
+              <w:rPr>
+                <w:bCs/>
                 <w:sz w:val="22"/>
                 <w:szCs w:val="22"/>
                 <w:lang w:val="en-GB"/>
               </w:rPr>
-            </w:pPr>
-          </w:p>
-          <w:p>
-            <w:pPr>
-              <w:spacing w:line="240" w:lineRule="auto"/>
-              <w:rPr>
+              <w:t xml:space="preserve"> </w:t>
+            </w:r>
+            <w:r>
+              <w:rPr>
+                <w:bCs/>
                 <w:sz w:val="22"/>
                 <w:szCs w:val="22"/>
                 <w:lang w:val="en-GB"/>
               </w:rPr>
-            </w:pPr>
-            <w:r>
-              <w:rPr>
-                <w:sz w:val="22"/>
-                <w:szCs w:val="22"/>
-                <w:lang w:val="en-GB"/>
-              </w:rPr>
-              <w:t xml:space="preserve">Open Charge Alliance, </w:t>
-            </w:r>
-            <w:r>
-              <w:rPr>
-                <w:i/>
-                <w:iCs/>
-                <w:sz w:val="22"/>
-                <w:szCs w:val="22"/>
-                <w:lang w:val="en-GB"/>
-              </w:rPr>
-              <w:t>Open Charge Point Protocol 1.6</w:t>
-            </w:r>
-            <w:r>
-              <w:rPr>
-                <w:sz w:val="22"/>
-                <w:szCs w:val="22"/>
-                <w:lang w:val="en-GB"/>
-              </w:rPr>
-              <w:t>, edition 2 FINAL, Sep. 28, 2017.</w:t>
-            </w:r>
-          </w:p>
-          <w:p>
-            <w:pPr>
-              <w:spacing w:line="240" w:lineRule="auto"/>
-              <w:rPr>
-                <w:sz w:val="22"/>
-                <w:szCs w:val="22"/>
-                <w:lang w:val="en-GB"/>
-              </w:rPr>
-            </w:pPr>
-          </w:p>
-          <w:p>
-            <w:pPr>
-              <w:spacing w:line="240" w:lineRule="auto"/>
-              <w:rPr>
-                <w:sz w:val="22"/>
-                <w:szCs w:val="22"/>
-                <w:lang w:val="en-US"/>
-              </w:rPr>
-            </w:pPr>
-            <w:r>
-              <w:rPr>
-                <w:sz w:val="22"/>
-                <w:szCs w:val="22"/>
-                <w:lang w:val="en-US"/>
-              </w:rPr>
-              <w:t xml:space="preserve">O. Sadeghian, A. </w:t>
-            </w:r>
-            <w:proofErr w:type="spellStart"/>
-            <w:r>
-              <w:rPr>
-                <w:sz w:val="22"/>
-                <w:szCs w:val="22"/>
-                <w:lang w:val="en-US"/>
-              </w:rPr>
-              <w:t>Oshnoei</w:t>
-            </w:r>
-            <w:proofErr w:type="spellEnd"/>
-            <w:r>
-              <w:rPr>
-                <w:sz w:val="22"/>
-                <w:szCs w:val="22"/>
-                <w:lang w:val="en-US"/>
-              </w:rPr>
-              <w:t>, B. Mohammadi-</w:t>
-            </w:r>
-            <w:proofErr w:type="spellStart"/>
-            <w:r>
-              <w:rPr>
-                <w:sz w:val="22"/>
-                <w:szCs w:val="22"/>
-                <w:lang w:val="en-US"/>
-              </w:rPr>
-              <w:t>ivatloo</w:t>
-            </w:r>
-            <w:proofErr w:type="spellEnd"/>
-            <w:r>
-              <w:rPr>
-                <w:sz w:val="22"/>
-                <w:szCs w:val="22"/>
-                <w:lang w:val="en-US"/>
-              </w:rPr>
-              <w:t xml:space="preserve">, V. </w:t>
-            </w:r>
-            <w:proofErr w:type="spellStart"/>
-            <w:r>
-              <w:rPr>
-                <w:sz w:val="22"/>
-                <w:szCs w:val="22"/>
-                <w:lang w:val="en-US"/>
-              </w:rPr>
-              <w:t>Vahidinasab</w:t>
-            </w:r>
-            <w:proofErr w:type="spellEnd"/>
-            <w:r>
-              <w:rPr>
-                <w:sz w:val="22"/>
-                <w:szCs w:val="22"/>
-                <w:lang w:val="en-US"/>
-              </w:rPr>
-              <w:t xml:space="preserve">, and A. Anvari-Moghaddam, “A comprehensive review on electric vehicles smart charging: Solutions, strategies, technologies, and challenges,” </w:t>
-            </w:r>
-            <w:r>
-              <w:rPr>
-                <w:i/>
-                <w:iCs/>
-                <w:sz w:val="22"/>
-                <w:szCs w:val="22"/>
-                <w:lang w:val="en-US"/>
-              </w:rPr>
-              <w:t>Journal of energy storage</w:t>
-            </w:r>
-            <w:r>
-              <w:rPr>
-                <w:sz w:val="22"/>
-                <w:szCs w:val="22"/>
-                <w:lang w:val="en-US"/>
-              </w:rPr>
-              <w:t xml:space="preserve">, vol. 54, p. 105241, 2022, </w:t>
-            </w:r>
-            <w:proofErr w:type="spellStart"/>
-            <w:r>
-              <w:rPr>
-                <w:sz w:val="22"/>
-                <w:szCs w:val="22"/>
-                <w:lang w:val="en-US"/>
-              </w:rPr>
-              <w:t>doi</w:t>
-            </w:r>
-            <w:proofErr w:type="spellEnd"/>
-            <w:r>
-              <w:rPr>
-                <w:sz w:val="22"/>
-                <w:szCs w:val="22"/>
-                <w:lang w:val="en-US"/>
-              </w:rPr>
-              <w:t>: 10.1016/j.est.2022.105241.</w:t>
-            </w:r>
-          </w:p>
-          <w:p>
-            <w:pPr>
-              <w:spacing w:line="240" w:lineRule="auto"/>
-              <w:rPr>
-                <w:sz w:val="22"/>
-                <w:szCs w:val="22"/>
-                <w:lang w:val="en-US"/>
-              </w:rPr>
-            </w:pPr>
-          </w:p>
-          <w:p>
-            <w:pPr>
-              <w:spacing w:line="240" w:lineRule="auto"/>
-              <w:rPr>
-                <w:sz w:val="22"/>
-                <w:szCs w:val="22"/>
-                <w:lang w:val="de-DE"/>
-              </w:rPr>
-            </w:pPr>
-            <w:r>
-              <w:rPr>
-                <w:sz w:val="22"/>
-                <w:szCs w:val="22"/>
-                <w:lang w:val="de-DE"/>
-              </w:rPr>
-              <w:t>Die Arbeit bietet</w:t>
-            </w:r>
-            <w:r>
-              <w:rPr>
-                <w:sz w:val="22"/>
-                <w:szCs w:val="22"/>
-                <w:lang w:val="de-DE"/>
-              </w:rPr>
-              <w:t xml:space="preserve"> einen </w:t>
-            </w:r>
-            <w:r>
-              <w:rPr>
-                <w:sz w:val="22"/>
-                <w:szCs w:val="22"/>
-              </w:rPr>
-              <w:t xml:space="preserve">Überblick über Smart-Charging-Lösungen für Elektrofahrzeuge und ordnen deren Strategien, Ziele, technische Infrastruktur sowie Herausforderungen ein. </w:t>
-            </w:r>
-            <w:r>
-              <w:rPr>
-                <w:sz w:val="22"/>
-                <w:szCs w:val="22"/>
-              </w:rPr>
-              <w:t>Es</w:t>
-            </w:r>
-            <w:r>
-              <w:rPr>
-                <w:sz w:val="22"/>
-                <w:szCs w:val="22"/>
-              </w:rPr>
-              <w:t xml:space="preserve"> behandel</w:t>
-            </w:r>
-            <w:r>
-              <w:rPr>
-                <w:sz w:val="22"/>
-                <w:szCs w:val="22"/>
-              </w:rPr>
-              <w:t>t</w:t>
-            </w:r>
-            <w:r>
-              <w:rPr>
-                <w:sz w:val="22"/>
-                <w:szCs w:val="22"/>
-              </w:rPr>
-              <w:t xml:space="preserve"> außerdem die Rolle von Aggregatoren, Lastprognosen und die Integration von Elektrofahrzeugen in Gebäude- und erneuerbare Energiesysteme.</w:t>
-            </w:r>
-          </w:p>
-          <w:p>
-            <w:pPr>
-              <w:spacing w:line="240" w:lineRule="auto"/>
-              <w:rPr>
-                <w:sz w:val="22"/>
-                <w:szCs w:val="22"/>
-                <w:lang w:val="de-DE"/>
-              </w:rPr>
-            </w:pPr>
-          </w:p>
-          <w:p>
-            <w:pPr>
-              <w:spacing w:line="240" w:lineRule="auto"/>
-              <w:rPr>
-                <w:sz w:val="22"/>
-                <w:szCs w:val="22"/>
-                <w:lang w:val="de-DE"/>
-              </w:rPr>
-            </w:pPr>
-          </w:p>
-          <w:p>
-            <w:pPr>
-              <w:spacing w:line="240" w:lineRule="auto"/>
-              <w:rPr>
-                <w:sz w:val="22"/>
-                <w:szCs w:val="22"/>
-                <w:lang w:val="en-US"/>
-              </w:rPr>
-            </w:pPr>
-            <w:proofErr w:type="spellStart"/>
-            <w:r>
-              <w:rPr>
-                <w:sz w:val="22"/>
-                <w:szCs w:val="22"/>
-                <w:lang w:val="en-US"/>
-              </w:rPr>
-              <w:t>OpenEMS</w:t>
-            </w:r>
-            <w:proofErr w:type="spellEnd"/>
-            <w:r>
-              <w:rPr>
-                <w:sz w:val="22"/>
-                <w:szCs w:val="22"/>
-                <w:lang w:val="en-US"/>
-              </w:rPr>
-              <w:t xml:space="preserve"> Association e. V., “Introduction,” </w:t>
-            </w:r>
-            <w:proofErr w:type="spellStart"/>
-            <w:r>
-              <w:rPr>
-                <w:sz w:val="22"/>
-                <w:szCs w:val="22"/>
-                <w:lang w:val="en-US"/>
-              </w:rPr>
-              <w:t>OpenEMS</w:t>
-            </w:r>
-            <w:proofErr w:type="spellEnd"/>
-            <w:r>
-              <w:rPr>
-                <w:sz w:val="22"/>
-                <w:szCs w:val="22"/>
-                <w:lang w:val="en-US"/>
-              </w:rPr>
-              <w:t xml:space="preserve"> Documentation. [Online]. Available: https://openems.github.io/openems.io/openems/latest/introduction.html. [Accessed: Oct. 11, 2026].</w:t>
-            </w:r>
-          </w:p>
-          <w:p>
-            <w:pPr>
-              <w:spacing w:line="240" w:lineRule="auto"/>
-              <w:rPr>
-                <w:sz w:val="22"/>
-                <w:szCs w:val="22"/>
-                <w:lang w:val="en-US"/>
-              </w:rPr>
-            </w:pPr>
-          </w:p>
-          <w:p>
-            <w:pPr>
-              <w:spacing w:line="240" w:lineRule="auto"/>
-              <w:rPr>
-                <w:sz w:val="22"/>
-                <w:szCs w:val="22"/>
-                <w:lang w:val="de-DE"/>
-              </w:rPr>
-            </w:pPr>
-            <w:proofErr w:type="spellStart"/>
-            <w:r>
-              <w:rPr>
-                <w:sz w:val="22"/>
-                <w:szCs w:val="22"/>
-              </w:rPr>
-              <w:t>OpenEMS</w:t>
-            </w:r>
-            <w:proofErr w:type="spellEnd"/>
-            <w:r>
-              <w:rPr>
-                <w:sz w:val="22"/>
-                <w:szCs w:val="22"/>
-              </w:rPr>
-              <w:t xml:space="preserve"> </w:t>
-            </w:r>
-            <w:r>
-              <w:rPr>
-                <w:sz w:val="22"/>
-                <w:szCs w:val="22"/>
-              </w:rPr>
-              <w:t>ist ein</w:t>
-            </w:r>
-            <w:r>
-              <w:rPr>
-                <w:sz w:val="22"/>
-                <w:szCs w:val="22"/>
-              </w:rPr>
-              <w:t xml:space="preserve"> modulares Energiemanagementsystem zur Überwachung und Steuerung von Speichern, erneuerbaren Energien und Geräten wie Ladestationen; seine Softwarearchitektur umfasst Edge für die lokale Datenerfassung und Steuerung, UI zur Anzeige sowie </w:t>
-            </w:r>
-            <w:proofErr w:type="gramStart"/>
-            <w:r>
-              <w:rPr>
-                <w:sz w:val="22"/>
-                <w:szCs w:val="22"/>
-              </w:rPr>
-              <w:t>Backend</w:t>
-            </w:r>
-            <w:proofErr w:type="gramEnd"/>
-            <w:r>
-              <w:rPr>
-                <w:sz w:val="22"/>
-                <w:szCs w:val="22"/>
-              </w:rPr>
-              <w:t xml:space="preserve"> für zentrale Überwachung und Verwaltung. Erweiterbarkeit und geräteunabhängige Steuerungsalgorithmen </w:t>
-            </w:r>
-            <w:r>
-              <w:rPr>
-                <w:sz w:val="22"/>
-                <w:szCs w:val="22"/>
-              </w:rPr>
-              <w:t>sind</w:t>
-            </w:r>
-            <w:r>
-              <w:rPr>
-                <w:sz w:val="22"/>
-                <w:szCs w:val="22"/>
-              </w:rPr>
-              <w:t xml:space="preserve"> zentrale Architekturmerkmal</w:t>
-            </w:r>
-            <w:r>
-              <w:rPr>
-                <w:sz w:val="22"/>
-                <w:szCs w:val="22"/>
-              </w:rPr>
-              <w:t>e.</w:t>
-            </w:r>
-          </w:p>
-          <w:p>
-            <w:pPr>
-              <w:spacing w:line="240" w:lineRule="auto"/>
-              <w:rPr>
-                <w:sz w:val="22"/>
-                <w:szCs w:val="22"/>
-                <w:lang w:val="de-DE"/>
-              </w:rPr>
-            </w:pPr>
-          </w:p>
-          <w:p>
-            <w:pPr>
-              <w:spacing w:line="240" w:lineRule="auto"/>
-              <w:rPr>
-                <w:b/>
-                <w:szCs w:val="22"/>
-                <w:lang w:val="de-DE"/>
-              </w:rPr>
-            </w:pPr>
+              <w:t>H. Xu, L. König, D. Cáliz, and H. Schmeck, "A generic user interface for energy management in smart homes," Energy Informatics, vol. 1, Art. no. 55, Dec. 2018, doi: 10.1186/s42162-018-0060-0.</w:t>
+            </w:r>
           </w:p>
         </w:tc>
       </w:tr>
@@ -1240,17 +935,8 @@
                 <w:sz w:val="22"/>
                 <w:szCs w:val="22"/>
               </w:rPr>
-              <w:t>Falls bereits bekannt: technische Rahmenbedingungen, Spezifikation der konkreten Anforderungen an die Lösung</w:t>
-            </w:r>
-          </w:p>
-          <w:p>
-            <w:pPr>
-              <w:spacing w:line="240" w:lineRule="auto"/>
-              <w:rPr>
-                <w:sz w:val="22"/>
-                <w:szCs w:val="22"/>
-              </w:rPr>
-            </w:pPr>
+              <w:t xml:space="preserve">Technische Rahmenbedingungen: </w:t>
+            </w:r>
             <w:r>
               <w:rPr>
                 <w:sz w:val="22"/>
@@ -1272,15 +958,6 @@
               </w:rPr>
               <w:t xml:space="preserve"> Elektro-Fahrzeug</w:t>
             </w:r>
-          </w:p>
-          <w:p>
-            <w:pPr>
-              <w:spacing w:line="240" w:lineRule="auto"/>
-              <w:rPr>
-                <w:sz w:val="22"/>
-                <w:szCs w:val="22"/>
-              </w:rPr>
-            </w:pPr>
           </w:p>
           <w:p>
             <w:pPr>
@@ -1515,17 +1192,39 @@
                 <w:sz w:val="22"/>
                 <w:szCs w:val="22"/>
               </w:rPr>
-              <w:t xml:space="preserve">. Integration in </w:t>
-            </w:r>
-            <w:proofErr w:type="spellStart"/>
-            <w:r>
-              <w:rPr>
-                <w:sz w:val="22"/>
-                <w:szCs w:val="22"/>
-              </w:rPr>
-              <w:t>OpenEMS</w:t>
-            </w:r>
-            <w:proofErr w:type="spellEnd"/>
+              <w:t>. Integration in OpenEMS</w:t>
+            </w:r>
+          </w:p>
+          <w:p>
+            <w:pPr>
+              <w:tabs>
+                <w:tab w:val="left" w:pos="5380"/>
+              </w:tabs>
+              <w:spacing w:line="240" w:lineRule="auto"/>
+              <w:rPr>
+                <w:sz w:val="22"/>
+                <w:szCs w:val="22"/>
+              </w:rPr>
+            </w:pPr>
+            <w:r>
+              <w:rPr>
+                <w:sz w:val="22"/>
+                <w:szCs w:val="22"/>
+              </w:rPr>
+              <w:t>8. Durchführung eines Tests der Anwendung</w:t>
+            </w:r>
+          </w:p>
+          <w:p>
+            <w:pPr>
+              <w:tabs>
+                <w:tab w:val="left" w:pos="5380"/>
+              </w:tabs>
+              <w:spacing w:line="240" w:lineRule="auto"/>
+              <w:rPr>
+                <w:sz w:val="22"/>
+                <w:szCs w:val="22"/>
+              </w:rPr>
+            </w:pPr>
           </w:p>
           <w:p>
             <w:pPr>
@@ -1604,25 +1303,7 @@
                 <w:sz w:val="22"/>
                 <w:szCs w:val="22"/>
               </w:rPr>
-              <w:t>Mögliche Ergebnisse (</w:t>
-            </w:r>
-            <w:proofErr w:type="spellStart"/>
-            <w:r>
-              <w:rPr>
-                <w:b/>
-                <w:sz w:val="22"/>
-                <w:szCs w:val="22"/>
-              </w:rPr>
-              <w:t>Deliverables</w:t>
-            </w:r>
-            <w:proofErr w:type="spellEnd"/>
-            <w:r>
-              <w:rPr>
-                <w:b/>
-                <w:sz w:val="22"/>
-                <w:szCs w:val="22"/>
-              </w:rPr>
-              <w:t>)</w:t>
+              <w:t>Mögliche Ergebnisse (Deliverables)</w:t>
             </w:r>
           </w:p>
         </w:tc>
@@ -1777,23 +1458,14 @@
                 <w:rFonts w:ascii="Times New Roman" w:eastAsia="Times New Roman" w:hAnsi="Times New Roman"/>
                 <w:lang w:eastAsia="de-DE"/>
               </w:rPr>
-              <w:t xml:space="preserve">und Abgabe </w:t>
-            </w:r>
-            <w:proofErr w:type="gramStart"/>
+              <w:t>und Abgabe Exposé light</w:t>
+            </w:r>
             <w:r>
               <w:rPr>
                 <w:rFonts w:ascii="Times New Roman" w:eastAsia="Times New Roman" w:hAnsi="Times New Roman"/>
                 <w:lang w:eastAsia="de-DE"/>
               </w:rPr>
-              <w:t>Exposé</w:t>
-            </w:r>
-            <w:proofErr w:type="gramEnd"/>
-            <w:r>
-              <w:rPr>
-                <w:rFonts w:ascii="Times New Roman" w:eastAsia="Times New Roman" w:hAnsi="Times New Roman"/>
-                <w:lang w:eastAsia="de-DE"/>
-              </w:rPr>
-              <w:t xml:space="preserve"> light</w:t>
+              <w:t xml:space="preserve"> bis </w:t>
             </w:r>
             <w:r>
               <w:rPr>
@@ -1835,6 +1507,13 @@
                 <w:rFonts w:ascii="Times New Roman" w:eastAsia="Times New Roman" w:hAnsi="Times New Roman"/>
                 <w:lang w:eastAsia="de-DE"/>
               </w:rPr>
+              <w:t xml:space="preserve">bis </w:t>
+            </w:r>
+            <w:r>
+              <w:rPr>
+                <w:rFonts w:ascii="Times New Roman" w:eastAsia="Times New Roman" w:hAnsi="Times New Roman"/>
+                <w:lang w:eastAsia="de-DE"/>
+              </w:rPr>
               <w:t>01.11.2026</w:t>
             </w:r>
           </w:p>
@@ -1863,6 +1542,13 @@
                 <w:rFonts w:ascii="Times New Roman" w:eastAsia="Times New Roman" w:hAnsi="Times New Roman"/>
                 <w:lang w:eastAsia="de-DE"/>
               </w:rPr>
+              <w:t xml:space="preserve"> bis</w:t>
+            </w:r>
+            <w:r>
+              <w:rPr>
+                <w:rFonts w:ascii="Times New Roman" w:eastAsia="Times New Roman" w:hAnsi="Times New Roman"/>
+                <w:lang w:eastAsia="de-DE"/>
+              </w:rPr>
               <w:t xml:space="preserve"> </w:t>
             </w:r>
             <w:r>
@@ -1912,6 +1598,13 @@
                 <w:rFonts w:ascii="Times New Roman" w:eastAsia="Times New Roman" w:hAnsi="Times New Roman"/>
                 <w:lang w:eastAsia="de-DE"/>
               </w:rPr>
+              <w:t xml:space="preserve"> bis</w:t>
+            </w:r>
+            <w:r>
+              <w:rPr>
+                <w:rFonts w:ascii="Times New Roman" w:eastAsia="Times New Roman" w:hAnsi="Times New Roman"/>
+                <w:lang w:eastAsia="de-DE"/>
+              </w:rPr>
               <w:t xml:space="preserve"> </w:t>
             </w:r>
             <w:r>
@@ -1940,28 +1633,35 @@
                 <w:rFonts w:ascii="Times New Roman" w:eastAsia="Times New Roman" w:hAnsi="Times New Roman"/>
                 <w:lang w:eastAsia="de-DE"/>
               </w:rPr>
-              <w:t>Besprechung</w:t>
+              <w:t xml:space="preserve">Laufende </w:t>
             </w:r>
             <w:r>
               <w:rPr>
                 <w:rFonts w:ascii="Times New Roman" w:eastAsia="Times New Roman" w:hAnsi="Times New Roman"/>
                 <w:lang w:eastAsia="de-DE"/>
               </w:rPr>
-              <w:t xml:space="preserve"> mit Betreuer</w:t>
+              <w:t>Besprechung</w:t>
             </w:r>
             <w:r>
               <w:rPr>
                 <w:rFonts w:ascii="Times New Roman" w:eastAsia="Times New Roman" w:hAnsi="Times New Roman"/>
                 <w:lang w:eastAsia="de-DE"/>
               </w:rPr>
-              <w:t xml:space="preserve"> zur </w:t>
+              <w:t xml:space="preserve"> mit Betreuer</w:t>
             </w:r>
             <w:r>
               <w:rPr>
                 <w:rFonts w:ascii="Times New Roman" w:eastAsia="Times New Roman" w:hAnsi="Times New Roman"/>
                 <w:lang w:eastAsia="de-DE"/>
               </w:rPr>
-              <w:t>bisherigen Arbeit 01.12.2026</w:t>
+              <w:t xml:space="preserve"> zum aktuellen Stand im zweiwöchigen Rhythmus</w:t>
+            </w:r>
+            <w:r>
+              <w:rPr>
+                <w:rFonts w:ascii="Times New Roman" w:eastAsia="Times New Roman" w:hAnsi="Times New Roman"/>
+                <w:lang w:eastAsia="de-DE"/>
+              </w:rPr>
+              <w:t xml:space="preserve"> </w:t>
             </w:r>
           </w:p>
           <w:p>
@@ -2252,11 +1952,127 @@
       </w:rPr>
     </w:lvl>
   </w:abstractNum>
+  <w:abstractNum w:abstractNumId="2" w15:restartNumberingAfterBreak="0">
+    <w:nsid w:val="6B3C2FBA"/>
+    <w:multiLevelType w:val="hybridMultilevel"/>
+    <w:tmpl w:val="6FB61A08"/>
+    <w:lvl w:ilvl="0" w:tplc="0C070001">
+      <w:start w:val="1"/>
+      <w:numFmt w:val="bullet"/>
+      <w:lvlText w:val=""/>
+      <w:lvlJc w:val="left"/>
+      <w:pPr>
+        <w:ind w:left="720" w:hanging="360"/>
+      </w:pPr>
+      <w:rPr>
+        <w:rFonts w:ascii="Symbol" w:hAnsi="Symbol" w:hint="default"/>
+      </w:rPr>
+    </w:lvl>
+    <w:lvl w:ilvl="1" w:tplc="0C070003" w:tentative="1">
+      <w:start w:val="1"/>
+      <w:numFmt w:val="bullet"/>
+      <w:lvlText w:val="o"/>
+      <w:lvlJc w:val="left"/>
+      <w:pPr>
+        <w:ind w:left="1440" w:hanging="360"/>
+      </w:pPr>
+      <w:rPr>
+        <w:rFonts w:ascii="Courier New" w:hAnsi="Courier New" w:cs="Courier New" w:hint="default"/>
+      </w:rPr>
+    </w:lvl>
+    <w:lvl w:ilvl="2" w:tplc="0C070005" w:tentative="1">
+      <w:start w:val="1"/>
+      <w:numFmt w:val="bullet"/>
+      <w:lvlText w:val=""/>
+      <w:lvlJc w:val="left"/>
+      <w:pPr>
+        <w:ind w:left="2160" w:hanging="360"/>
+      </w:pPr>
+      <w:rPr>
+        <w:rFonts w:ascii="Wingdings" w:hAnsi="Wingdings" w:hint="default"/>
+      </w:rPr>
+    </w:lvl>
+    <w:lvl w:ilvl="3" w:tplc="0C070001" w:tentative="1">
+      <w:start w:val="1"/>
+      <w:numFmt w:val="bullet"/>
+      <w:lvlText w:val=""/>
+      <w:lvlJc w:val="left"/>
+      <w:pPr>
+        <w:ind w:left="2880" w:hanging="360"/>
+      </w:pPr>
+      <w:rPr>
+        <w:rFonts w:ascii="Symbol" w:hAnsi="Symbol" w:hint="default"/>
+      </w:rPr>
+    </w:lvl>
+    <w:lvl w:ilvl="4" w:tplc="0C070003" w:tentative="1">
+      <w:start w:val="1"/>
+      <w:numFmt w:val="bullet"/>
+      <w:lvlText w:val="o"/>
+      <w:lvlJc w:val="left"/>
+      <w:pPr>
+        <w:ind w:left="3600" w:hanging="360"/>
+      </w:pPr>
+      <w:rPr>
+        <w:rFonts w:ascii="Courier New" w:hAnsi="Courier New" w:cs="Courier New" w:hint="default"/>
+      </w:rPr>
+    </w:lvl>
+    <w:lvl w:ilvl="5" w:tplc="0C070005" w:tentative="1">
+      <w:start w:val="1"/>
+      <w:numFmt w:val="bullet"/>
+      <w:lvlText w:val=""/>
+      <w:lvlJc w:val="left"/>
+      <w:pPr>
+        <w:ind w:left="4320" w:hanging="360"/>
+      </w:pPr>
+      <w:rPr>
+        <w:rFonts w:ascii="Wingdings" w:hAnsi="Wingdings" w:hint="default"/>
+      </w:rPr>
+    </w:lvl>
+    <w:lvl w:ilvl="6" w:tplc="0C070001" w:tentative="1">
+      <w:start w:val="1"/>
+      <w:numFmt w:val="bullet"/>
+      <w:lvlText w:val=""/>
+      <w:lvlJc w:val="left"/>
+      <w:pPr>
+        <w:ind w:left="5040" w:hanging="360"/>
+      </w:pPr>
+      <w:rPr>
+        <w:rFonts w:ascii="Symbol" w:hAnsi="Symbol" w:hint="default"/>
+      </w:rPr>
+    </w:lvl>
+    <w:lvl w:ilvl="7" w:tplc="0C070003" w:tentative="1">
+      <w:start w:val="1"/>
+      <w:numFmt w:val="bullet"/>
+      <w:lvlText w:val="o"/>
+      <w:lvlJc w:val="left"/>
+      <w:pPr>
+        <w:ind w:left="5760" w:hanging="360"/>
+      </w:pPr>
+      <w:rPr>
+        <w:rFonts w:ascii="Courier New" w:hAnsi="Courier New" w:cs="Courier New" w:hint="default"/>
+      </w:rPr>
+    </w:lvl>
+    <w:lvl w:ilvl="8" w:tplc="0C070005" w:tentative="1">
+      <w:start w:val="1"/>
+      <w:numFmt w:val="bullet"/>
+      <w:lvlText w:val=""/>
+      <w:lvlJc w:val="left"/>
+      <w:pPr>
+        <w:ind w:left="6480" w:hanging="360"/>
+      </w:pPr>
+      <w:rPr>
+        <w:rFonts w:ascii="Wingdings" w:hAnsi="Wingdings" w:hint="default"/>
+      </w:rPr>
+    </w:lvl>
+  </w:abstractNum>
   <w:num w:numId="1" w16cid:durableId="1492602618">
     <w:abstractNumId w:val="1"/>
   </w:num>
   <w:num w:numId="2" w16cid:durableId="1637561732">
     <w:abstractNumId w:val="0"/>
+  </w:num>
+  <w:num w:numId="3" w16cid:durableId="662660251">
+    <w:abstractNumId w:val="2"/>
   </w:num>
 </w:numbering>
 </file>

</xml_diff>